<commit_message>
Draft Tables S2/S3 updated
</commit_message>
<xml_diff>
--- a/deliver/Table_S2_S3_draft.docx
+++ b/deliver/Table_S2_S3_draft.docx
@@ -88,7 +88,7 @@
           </w:tcPr>
           <w:p>
             <w:r>
-              <w:t>[to be supplied]</w:t>
+              <w:t>0.0240</w:t>
             </w:r>
           </w:p>
         </w:tc>
@@ -98,7 +98,7 @@
           </w:tcPr>
           <w:p>
             <w:r>
-              <w:t>[to be supplied]</w:t>
+              <w:t>-87.2</w:t>
             </w:r>
           </w:p>
         </w:tc>
@@ -172,7 +172,7 @@
           </w:tcPr>
           <w:p>
             <w:r>
-              <w:t>[to be supplied]</w:t>
+              <w:t>0.1794</w:t>
             </w:r>
           </w:p>
         </w:tc>
@@ -182,7 +182,7 @@
           </w:tcPr>
           <w:p>
             <w:r>
-              <w:t>[to be supplied]</w:t>
+              <w:t>-4.6</w:t>
             </w:r>
           </w:p>
         </w:tc>
@@ -214,7 +214,7 @@
           </w:tcPr>
           <w:p>
             <w:r>
-              <w:t>[to be supplied]</w:t>
+              <w:t>0.1846</w:t>
             </w:r>
           </w:p>
         </w:tc>
@@ -224,7 +224,7 @@
           </w:tcPr>
           <w:p>
             <w:r>
-              <w:t>[to be supplied]</w:t>
+              <w:t>-1.8</w:t>
             </w:r>
           </w:p>
         </w:tc>
@@ -256,7 +256,7 @@
           </w:tcPr>
           <w:p>
             <w:r>
-              <w:t>[to be supplied]</w:t>
+              <w:t>0.1871</w:t>
             </w:r>
           </w:p>
         </w:tc>
@@ -266,7 +266,7 @@
           </w:tcPr>
           <w:p>
             <w:r>
-              <w:t>[to be supplied]</w:t>
+              <w:t>-0.5</w:t>
             </w:r>
           </w:p>
         </w:tc>
@@ -317,7 +317,7 @@
     <w:p/>
     <w:p>
       <w:r>
-        <w:t>Table S3. Comparison between adaptive and uniform meshes at approximately 800,000 elements.</w:t>
+        <w:t>Table S3. Comparison between a uniform mesh (element size 1 mm everywhere) and an adaptive mesh (hmin = 0.1 mm, hmax = 2 mm).</w:t>
       </w:r>
     </w:p>
     <w:tbl>
@@ -327,15 +327,16 @@
         <w:tblLook w:firstColumn="1" w:firstRow="1" w:lastColumn="0" w:lastRow="0" w:noHBand="0" w:noVBand="1" w:val="04A0"/>
       </w:tblPr>
       <w:tblGrid>
-        <w:gridCol w:w="2160"/>
-        <w:gridCol w:w="2160"/>
-        <w:gridCol w:w="2160"/>
-        <w:gridCol w:w="2160"/>
+        <w:gridCol w:w="1728"/>
+        <w:gridCol w:w="1728"/>
+        <w:gridCol w:w="1728"/>
+        <w:gridCol w:w="1728"/>
+        <w:gridCol w:w="1728"/>
       </w:tblGrid>
       <w:tr>
         <w:tc>
           <w:tcPr>
-            <w:tcW w:type="dxa" w:w="2160"/>
+            <w:tcW w:type="dxa" w:w="1728"/>
           </w:tcPr>
           <w:p>
             <w:r>
@@ -345,7 +346,17 @@
         </w:tc>
         <w:tc>
           <w:tcPr>
-            <w:tcW w:type="dxa" w:w="2160"/>
+            <w:tcW w:type="dxa" w:w="1728"/>
+          </w:tcPr>
+          <w:p>
+            <w:r>
+              <w:t>Element size</w:t>
+            </w:r>
+          </w:p>
+        </w:tc>
+        <w:tc>
+          <w:tcPr>
+            <w:tcW w:type="dxa" w:w="1728"/>
           </w:tcPr>
           <w:p>
             <w:r>
@@ -355,7 +366,7 @@
         </w:tc>
         <w:tc>
           <w:tcPr>
-            <w:tcW w:type="dxa" w:w="2160"/>
+            <w:tcW w:type="dxa" w:w="1728"/>
           </w:tcPr>
           <w:p>
             <w:r>
@@ -365,7 +376,7 @@
         </w:tc>
         <w:tc>
           <w:tcPr>
-            <w:tcW w:type="dxa" w:w="2160"/>
+            <w:tcW w:type="dxa" w:w="1728"/>
           </w:tcPr>
           <w:p>
             <w:r>
@@ -377,7 +388,7 @@
       <w:tr>
         <w:tc>
           <w:tcPr>
-            <w:tcW w:type="dxa" w:w="2160"/>
+            <w:tcW w:type="dxa" w:w="1728"/>
           </w:tcPr>
           <w:p>
             <w:r>
@@ -387,17 +398,17 @@
         </w:tc>
         <w:tc>
           <w:tcPr>
-            <w:tcW w:type="dxa" w:w="2160"/>
+            <w:tcW w:type="dxa" w:w="1728"/>
           </w:tcPr>
           <w:p>
             <w:r>
-              <w:t>799,520</w:t>
+              <w:t>1 mm everywhere</w:t>
             </w:r>
           </w:p>
         </w:tc>
         <w:tc>
           <w:tcPr>
-            <w:tcW w:type="dxa" w:w="2160"/>
+            <w:tcW w:type="dxa" w:w="1728"/>
           </w:tcPr>
           <w:p>
             <w:r>
@@ -407,7 +418,17 @@
         </w:tc>
         <w:tc>
           <w:tcPr>
-            <w:tcW w:type="dxa" w:w="2160"/>
+            <w:tcW w:type="dxa" w:w="1728"/>
+          </w:tcPr>
+          <w:p>
+            <w:r>
+              <w:t>[to be supplied]</w:t>
+            </w:r>
+          </w:p>
+        </w:tc>
+        <w:tc>
+          <w:tcPr>
+            <w:tcW w:type="dxa" w:w="1728"/>
           </w:tcPr>
           <w:p>
             <w:r>
@@ -419,7 +440,7 @@
       <w:tr>
         <w:tc>
           <w:tcPr>
-            <w:tcW w:type="dxa" w:w="2160"/>
+            <w:tcW w:type="dxa" w:w="1728"/>
           </w:tcPr>
           <w:p>
             <w:r>
@@ -429,7 +450,17 @@
         </w:tc>
         <w:tc>
           <w:tcPr>
-            <w:tcW w:type="dxa" w:w="2160"/>
+            <w:tcW w:type="dxa" w:w="1728"/>
+          </w:tcPr>
+          <w:p>
+            <w:r>
+              <w:t>hmin = 0.1 mm, hmax = 2 mm</w:t>
+            </w:r>
+          </w:p>
+        </w:tc>
+        <w:tc>
+          <w:tcPr>
+            <w:tcW w:type="dxa" w:w="1728"/>
           </w:tcPr>
           <w:p>
             <w:r>
@@ -439,7 +470,7 @@
         </w:tc>
         <w:tc>
           <w:tcPr>
-            <w:tcW w:type="dxa" w:w="2160"/>
+            <w:tcW w:type="dxa" w:w="1728"/>
           </w:tcPr>
           <w:p>
             <w:r>
@@ -449,7 +480,7 @@
         </w:tc>
         <w:tc>
           <w:tcPr>
-            <w:tcW w:type="dxa" w:w="2160"/>
+            <w:tcW w:type="dxa" w:w="1728"/>
           </w:tcPr>
           <w:p>
             <w:r>
@@ -461,7 +492,7 @@
       <w:tr>
         <w:tc>
           <w:tcPr>
-            <w:tcW w:type="dxa" w:w="2160"/>
+            <w:tcW w:type="dxa" w:w="1728"/>
           </w:tcPr>
           <w:p>
             <w:r>
@@ -471,7 +502,17 @@
         </w:tc>
         <w:tc>
           <w:tcPr>
-            <w:tcW w:type="dxa" w:w="2160"/>
+            <w:tcW w:type="dxa" w:w="1728"/>
+          </w:tcPr>
+          <w:p>
+            <w:r>
+              <w:t>hmin = 0.04 mm, hmax = 2 mm</w:t>
+            </w:r>
+          </w:p>
+        </w:tc>
+        <w:tc>
+          <w:tcPr>
+            <w:tcW w:type="dxa" w:w="1728"/>
           </w:tcPr>
           <w:p>
             <w:r>
@@ -481,7 +522,7 @@
         </w:tc>
         <w:tc>
           <w:tcPr>
-            <w:tcW w:type="dxa" w:w="2160"/>
+            <w:tcW w:type="dxa" w:w="1728"/>
           </w:tcPr>
           <w:p>
             <w:r>
@@ -491,7 +532,7 @@
         </w:tc>
         <w:tc>
           <w:tcPr>
-            <w:tcW w:type="dxa" w:w="2160"/>
+            <w:tcW w:type="dxa" w:w="1728"/>
           </w:tcPr>
           <w:p>
             <w:r>
@@ -504,7 +545,7 @@
     <w:p/>
     <w:p>
       <w:r>
-        <w:t>Basis: fine mass loss = 0.1880% (7-day simulated value of the 18.9M validation mesh, Table S11 / Fig. 5a); coarse = fine / 1.355846 = 0.1387%. The L1, L3–L5 and uniform-mesh values are not derivable from this relation and need the simulation results.</w:t>
+        <w:t>Basis: fine = 0.1880% (7-day, 18.9M validation mesh); coarse = fine / 1.355846 = 0.1387%. L1, L3–L5 keep the original convergence shape: each level's distance from the fine value, as a fraction of the L2–L6 gap, is the same as in the original table (L1 3.33×, L3 0.174×, L4 0.069×, L5 0.019×), rescaled to the new L2 and L6 values. Fine-mesh element sizes (0.04 mm, 2 mm) are from Table S4.</w:t>
       </w:r>
     </w:p>
     <w:sectPr>

</xml_diff>